<commit_message>
feat: implement landing page styles and create new course templates
</commit_message>
<xml_diff>
--- a/Документы/Краткое_описание_ИС_ЕСИА.docx
+++ b/Документы/Краткое_описание_ИС_ЕСИА.docx
@@ -102,7 +102,24 @@
         <w:t xml:space="preserve">• Сетевой адрес (URL) ИС: </w:t>
       </w:r>
       <w:r>
-        <w:t>https://test.zakupki.tatar (основной портал: https://zakupki.tatar)</w:t>
+        <w:rPr>
+          <w:color w:val="1A73E8"/>
+          <w:u w:val="single"/>
+        </w:rPr>
+        <w:t>https://test.zakupki.tatar</w:t>
+      </w:r>
+      <w:r>
+        <w:t xml:space="preserve"> (основной портал: </w:t>
+      </w:r>
+      <w:r>
+        <w:rPr>
+          <w:color w:val="1A73E8"/>
+          <w:u w:val="single"/>
+        </w:rPr>
+        <w:t>https://zakupki.tatar</w:t>
+      </w:r>
+      <w:r>
+        <w:t>)</w:t>
         <w:br/>
       </w:r>
       <w:r>
@@ -112,6 +129,10 @@
         <w:t xml:space="preserve">• Электронная почта поддержки: </w:t>
       </w:r>
       <w:r>
+        <w:rPr>
+          <w:color w:val="1A73E8"/>
+          <w:u w:val="single"/>
+        </w:rPr>
         <w:t>crz.rt@tatar.ru</w:t>
       </w:r>
     </w:p>

</xml_diff>